<commit_message>
Fix Team Meeting 10 table formatting - merge duplicate Item/Details tables
</commit_message>
<xml_diff>
--- a/Team-Meeting-10.docx
+++ b/Team-Meeting-10.docx
@@ -85,101 +85,6 @@
         <w:t xml:space="preserve">that is linked in the syllabus under the 4/23 row (Company A or Company B, Management v.s. Union [Slide]). Both teams work on the same deck but on different slides.</w:t>
       </w:r>
     </w:p>
-    <w:p>
-      <w:pPr>
-        <w:pStyle w:val="BodyText"/>
-      </w:pPr>
-      <w:r>
-        <w:rPr>
-          <w:b/>
-          <w:bCs/>
-        </w:rPr>
-        <w:t xml:space="preserve">Which team is this?</w:t>
-      </w:r>
-    </w:p>
-    <w:tbl>
-      <w:tblPr>
-        <w:tblW w:type="pct" w:w="5000"/>
-        <w:tblStyle w:val="Table"/>
-        <w:tblLook w:firstRow="0" w:lastRow="0" w:firstColumn="0" w:lastColumn="0" w:noHBand="0" w:noVBand="0" w:val="0000"/>
-        <w:tblBorders>
-          <w:top w:val="single" w:sz="4" w:space="0" w:color="000000"/>
-          <w:left w:val="single" w:sz="4" w:space="0" w:color="000000"/>
-          <w:bottom w:val="single" w:sz="4" w:space="0" w:color="000000"/>
-          <w:right w:val="single" w:sz="4" w:space="0" w:color="000000"/>
-          <w:insideH w:val="single" w:sz="4" w:space="0" w:color="000000"/>
-          <w:insideV w:val="single" w:sz="4" w:space="0" w:color="000000"/>
-        </w:tblBorders>
-      </w:tblPr>
-      <w:tblGrid>
-        <w:gridCol w:w="3960"/>
-        <w:gridCol w:w="3960"/>
-      </w:tblGrid>
-      <w:tr>
-        <w:tc>
-          <w:tcPr/>
-          <w:p>
-            <w:pPr>
-              <w:pStyle w:val="Compact"/>
-            </w:pPr>
-            <w:r>
-              <w:t xml:space="preserve">Our Team (Union or Management)</w:t>
-            </w:r>
-          </w:p>
-        </w:tc>
-        <w:tc>
-          <w:tcPr/>
-          <w:p>
-            <w:pPr>
-              <w:pStyle w:val="Compact"/>
-            </w:pPr>
-          </w:p>
-        </w:tc>
-      </w:tr>
-      <w:tr>
-        <w:tc>
-          <w:tcPr/>
-          <w:p>
-            <w:pPr>
-              <w:pStyle w:val="Compact"/>
-            </w:pPr>
-            <w:r>
-              <w:t xml:space="preserve">Our Team Number</w:t>
-            </w:r>
-          </w:p>
-        </w:tc>
-        <w:tc>
-          <w:tcPr/>
-          <w:p>
-            <w:pPr>
-              <w:pStyle w:val="Compact"/>
-            </w:pPr>
-          </w:p>
-        </w:tc>
-      </w:tr>
-      <w:tr>
-        <w:tc>
-          <w:tcPr/>
-          <w:p>
-            <w:pPr>
-              <w:pStyle w:val="Compact"/>
-            </w:pPr>
-            <w:r>
-              <w:t xml:space="preserve">Our Negotiation Counterpart Team Number</w:t>
-            </w:r>
-          </w:p>
-        </w:tc>
-        <w:tc>
-          <w:tcPr/>
-          <w:p>
-            <w:pPr>
-              <w:pStyle w:val="Compact"/>
-            </w:pPr>
-          </w:p>
-        </w:tc>
-      </w:tr>
-    </w:tbl>
-    <w:p/>
     <w:tbl>
       <w:tblPr>
         <w:tblW w:type="pct" w:w="5000"/>
@@ -222,6 +127,69 @@
             <w:r>
               <w:t xml:space="preserve">Details</w:t>
             </w:r>
+          </w:p>
+        </w:tc>
+      </w:tr>
+      <w:tr>
+        <w:tc>
+          <w:tcPr/>
+          <w:p>
+            <w:pPr>
+              <w:pStyle w:val="Compact"/>
+            </w:pPr>
+            <w:r>
+              <w:t xml:space="preserve">Our Team (Union or Management)</w:t>
+            </w:r>
+          </w:p>
+        </w:tc>
+        <w:tc>
+          <w:tcPr/>
+          <w:p>
+            <w:pPr>
+              <w:pStyle w:val="Compact"/>
+            </w:pPr>
+          </w:p>
+        </w:tc>
+      </w:tr>
+      <w:tr>
+        <w:tc>
+          <w:tcPr/>
+          <w:p>
+            <w:pPr>
+              <w:pStyle w:val="Compact"/>
+            </w:pPr>
+            <w:r>
+              <w:t xml:space="preserve">Our Team Number</w:t>
+            </w:r>
+          </w:p>
+        </w:tc>
+        <w:tc>
+          <w:tcPr/>
+          <w:p>
+            <w:pPr>
+              <w:pStyle w:val="Compact"/>
+            </w:pPr>
+          </w:p>
+        </w:tc>
+      </w:tr>
+      <w:tr>
+        <w:tc>
+          <w:tcPr/>
+          <w:p>
+            <w:pPr>
+              <w:pStyle w:val="Compact"/>
+            </w:pPr>
+            <w:r>
+              <w:t xml:space="preserve">Our Negotiation Counterpart Team Number</w:t>
+            </w:r>
+          </w:p>
+        </w:tc>
+        <w:tc>
+          <w:tcPr/>
+          <w:p>
+            <w:pPr>
+              <w:pStyle w:val="Compact"/>
+            </w:pPr>
           </w:p>
         </w:tc>
       </w:tr>

</xml_diff>